<commit_message>
Lastversorgung CN2 auf 5-12 V, Widerstandswerte entfernt
- D1 TVS P6KE33A -> P6KE18A (Schaltplan, PCB, Aufdruck)
- Beschriftung CN2/VLOAD 12-24V -> 5-12V, Aufdruck 5V-24V -> 5V-12V
- R1-R16 ohne Wert: Anwender legt sie selbst aus, LED-Empfehlung steht auf der Platine
- Projektbeschreibung, Hardware-Beschreibung, README angepasst
- ULN2803A und ESP-Versorgung ueber CN1 bleiben unveraendert

Co-Authored-By: Claude Opus 5.5 (1M context) <noreply@anthropic.com>
Claude-Session: https://claude.ai/code/session_015ZTAHN4h1MhX6WfGWCfmx3
</commit_message>
<xml_diff>
--- a/docs/Hardware-Beschreibung_C3_S3.docx
+++ b/docs/Hardware-Beschreibung_C3_S3.docx
@@ -20,7 +20,7 @@
           <w:sz w:val="22"/>
           <w:szCs w:val="22"/>
         </w:rPr>
-        <w:t xml:space="preserve">Schaltboards mit ESP32-C3 SuperMini und ESP32-S3-Zero · Stand 16.10.2026</w:t>
+        <w:t xml:space="preserve">Schaltboards mit ESP32-C3 SuperMini und ESP32-S3-Zero · Stand 18.10.2026</w:t>
       </w:r>
     </w:p>
     <w:p>
@@ -36,7 +36,7 @@
         <w:spacing w:after="120"/>
       </w:pPr>
       <w:r>
-        <w:t>Das RC-Multiswitch ist ein 8-kanaliges Schaltmodul für RC-Anwendungen (Licht, Zusatzfunktionen, Sound-Trigger). Die Kanäle werden über das CRSF-Protokoll (420 000 Baud) vom Empfänger angesteuert. Ein ULN2803A schaltet gegen Masse (Low-Side) Lasten mit 12–24 V; ein ESP32 übernimmt Protokoll, Logik und Konfiguration (WLAN-Web-UI, Lua-Script).</w:t>
+        <w:t xml:space="preserve">Das RC-Multiswitch ist ein 8-kanaliges Schaltmodul für RC-Anwendungen (Licht, Zusatzfunktionen, Sound-Trigger). Die Kanäle werden über das CRSF-Protokoll (420 000 Baud) vom Empfänger angesteuert. Ein ULN2803A schaltet gegen Masse (Low-Side) Lasten mit 5–12 V; ein ESP32 übernimmt Protokoll, Logik und Konfiguration (WLAN-Web-UI, Lua-Script).</w:t>
       </w:r>
     </w:p>
     <w:p>
@@ -783,10 +783,10 @@
           <w:b/>
           <w:bCs/>
         </w:rPr>
-        <w:t xml:space="preserve">Lastversorgung:</w:t>
+        <w:t xml:space="preserve">Lastversorgung: CN2 (JST PH, 2-polig), 5–12 V, als VLOAD an COM des ULN und auf J1. TVS-Diode D1 P6KE18A schützt vor Spannungsspitzen.</w:t>
       </w:r>
       <w:r>
-        <w:t xml:space="preserve"> CN2 (JST PH, 2-polig), 12–24 V, als VLOAD an COM des ULN und auf J1. TVS-Diode D1 P6KE33A schützt vor Spannungsspitzen.</w:t>
+        <w:t xml:space="preserve"/>
       </w:r>
     </w:p>
     <w:p>
@@ -821,10 +821,10 @@
           <w:b/>
           <w:bCs/>
         </w:rPr>
-        <w:t xml:space="preserve">Kontroll-LEDs:</w:t>
+        <w:t xml:space="preserve">Kontroll-LEDs: LED1–8 mit R1–R8 je Kanal vom Steuersignal gegen GND – leuchtet, wenn der Kanal aktiv ist. Die Werte von R1–R8 legt der Anwender fest; eine Empfehlung ist auf der Platine aufgedruckt.</w:t>
       </w:r>
       <w:r>
-        <w:t xml:space="preserve"> LED1–8 mit R1–R8 (150 Ω) je Kanal vom Steuersignal gegen GND – leuchtet, wenn der Kanal aktiv ist.</w:t>
+        <w:t xml:space="preserve"/>
       </w:r>
     </w:p>
     <w:p>
@@ -840,10 +840,10 @@
           <w:b/>
           <w:bCs/>
         </w:rPr>
-        <w:t xml:space="preserve">Ausgänge:</w:t>
+        <w:t xml:space="preserve">Ausgänge: J1 (2×8-Stiftleiste, 2,54 mm): ungerade Pins = OUT1…OUT8 (nach Serienwiderstand R9–R16, Wert vom Anwender), gerade Pins = VLOAD.</w:t>
       </w:r>
       <w:r>
-        <w:t xml:space="preserve"> J1 (2×8-Stiftleiste, 2,54 mm): ungerade Pins = OUT1…OUT8 (nach Serienwiderstand R9–R16, 150 Ω), gerade Pins = VLOAD.</w:t>
+        <w:t xml:space="preserve"/>
       </w:r>
     </w:p>
     <w:p>
@@ -1536,7 +1536,7 @@
                 <w:sz w:val="18"/>
                 <w:szCs w:val="18"/>
               </w:rPr>
-              <w:t xml:space="preserve">VLOAD (+12…24 V)</w:t>
+              <w:t xml:space="preserve">VLOAD (+5…12 V)</w:t>
             </w:r>
           </w:p>
         </w:tc>
@@ -5591,7 +5591,7 @@
                 <w:sz w:val="18"/>
                 <w:szCs w:val="18"/>
               </w:rPr>
-              <w:t xml:space="preserve">12V</w:t>
+              <w:t xml:space="preserve">5-12V</w:t>
             </w:r>
           </w:p>
         </w:tc>
@@ -5700,7 +5700,7 @@
                 <w:sz w:val="18"/>
                 <w:szCs w:val="18"/>
               </w:rPr>
-              <w:t xml:space="preserve">P6KE33A</w:t>
+              <w:t xml:space="preserve">P6KE18A</w:t>
             </w:r>
           </w:p>
         </w:tc>
@@ -6136,7 +6136,7 @@
                 <w:sz w:val="18"/>
                 <w:szCs w:val="18"/>
               </w:rPr>
-              <w:t xml:space="preserve">150</w:t>
+              <w:t xml:space="preserve">vom Anwender</w:t>
             </w:r>
           </w:p>
         </w:tc>
@@ -8527,7 +8527,7 @@
                 <w:sz w:val="18"/>
                 <w:szCs w:val="18"/>
               </w:rPr>
-              <w:t xml:space="preserve">12V</w:t>
+              <w:t xml:space="preserve">5-12V</w:t>
             </w:r>
           </w:p>
         </w:tc>
@@ -8636,7 +8636,7 @@
                 <w:sz w:val="18"/>
                 <w:szCs w:val="18"/>
               </w:rPr>
-              <w:t xml:space="preserve">P6KE33A</w:t>
+              <w:t xml:space="preserve">P6KE18A</w:t>
             </w:r>
           </w:p>
         </w:tc>
@@ -9181,7 +9181,7 @@
                 <w:sz w:val="18"/>
                 <w:szCs w:val="18"/>
               </w:rPr>
-              <w:t xml:space="preserve">150</w:t>
+              <w:t xml:space="preserve">vom Anwender</w:t>
             </w:r>
           </w:p>
         </w:tc>
@@ -9580,10 +9580,10 @@
           <w:b/>
           <w:bCs/>
         </w:rPr>
-        <w:t xml:space="preserve">Serienwiderstände R9–R16 (150 Ω) im Ausgang:</w:t>
+        <w:t xml:space="preserve">Serienwiderstände R9–R16 im Ausgang: kein Wert vorgegeben. Der Anwender legt sie passend zu Verbraucher und Lastspannung (5–12 V) aus, Strom und Verlustleistung beachten. Für Lasten ohne Vorwiderstand (z. B. Relais) eine Drahtbrücke einsetzen.</w:t>
       </w:r>
       <w:r>
-        <w:t xml:space="preserve"> gedacht für direkt angeschlossene LEDs/kleine Lasten. Bei Lasten über ca. 50 mA verursachen sie einen zu hohen Spannungsabfall (bei 12 V und 80 mA bereits 12 V) – für solche Kanäle den Widerstand durch eine Drahtbrücke oder einen kleineren Wert ersetzen.</w:t>
+        <w:t xml:space="preserve"/>
       </w:r>
     </w:p>
     <w:p>
@@ -9595,7 +9595,7 @@
         </w:numPr>
       </w:pPr>
       <w:r>
-        <w:t xml:space="preserve">Kontroll-LEDs: bei 3,3 V und 150 Ω fließen rot ca. 9 mA, grün/blau/weiß nur ca. 2 mA (Helligkeit gering, aber ausreichend).</w:t>
+        <w:t xml:space="preserve">Kontroll-LEDs: R1–R8 legt der Anwender fest. Die Empfehlung für 3,3 V ist auf der Platine aufgedruckt (Rot/Gelb 270 Ω, Grün 220 Ω, Blau/Weiß 56 Ω, ca. 5 mA).</w:t>
       </w:r>
     </w:p>
     <w:p>

</xml_diff>